<commit_message>
primera historia de usuario
</commit_message>
<xml_diff>
--- a/Documentation/Requerimientos funcionales.docx
+++ b/Documentation/Requerimientos funcionales.docx
@@ -519,6 +519,62 @@
         </w:rPr>
         <w:t>Generar soporte de todas las acciones del sistema.</w:t>
       </w:r>
+    </w:p>
+    <w:p>
+      <w:pPr>
+        <w:ind w:left="360"/>
+        <w:rPr>
+          <w:lang w:val="es-ES"/>
+        </w:rPr>
+      </w:pPr>
+    </w:p>
+    <w:p>
+      <w:pPr>
+        <w:pStyle w:val="Prrafodelista"/>
+        <w:numPr>
+          <w:ilvl w:val="0"/>
+          <w:numId w:val="1"/>
+        </w:numPr>
+        <w:rPr>
+          <w:b/>
+          <w:bCs/>
+          <w:lang w:val="es-ES"/>
+        </w:rPr>
+      </w:pPr>
+      <w:r>
+        <w:rPr>
+          <w:b/>
+          <w:bCs/>
+          <w:lang w:val="es-ES"/>
+        </w:rPr>
+        <w:t xml:space="preserve">Menú </w:t>
+      </w:r>
+    </w:p>
+    <w:p>
+      <w:pPr>
+        <w:pStyle w:val="Prrafodelista"/>
+        <w:numPr>
+          <w:ilvl w:val="1"/>
+          <w:numId w:val="1"/>
+        </w:numPr>
+        <w:rPr>
+          <w:lang w:val="es-ES"/>
+        </w:rPr>
+      </w:pPr>
+      <w:r>
+        <w:rPr>
+          <w:lang w:val="es-ES"/>
+        </w:rPr>
+        <w:t>Menú interactivo para que el usuario pueda usar las funciones del sistema</w:t>
+      </w:r>
+    </w:p>
+    <w:p>
+      <w:pPr>
+        <w:ind w:left="360"/>
+        <w:rPr>
+          <w:lang w:val="es-ES"/>
+        </w:rPr>
+      </w:pPr>
     </w:p>
     <w:p>
       <w:pPr>

</xml_diff>